<commit_message>
ispravljen fundiranje_umetnika SSU, promaklo mi je nesto
Change-Id: I40b23508f9a54c351029d36be1c8c146cd9c3e8f
</commit_message>
<xml_diff>
--- a/SSU/Fundiranje_umetnika.docx
+++ b/SSU/Fundiranje_umetnika.docx
@@ -916,7 +916,7 @@
           <w:r>
             <w:fldChar w:fldCharType="separate"/>
           </w:r>
-          <w:hyperlink w:anchor="_Toc205856382" w:history="1">
+          <w:hyperlink w:anchor="_Toc205890454" w:history="1">
             <w:r>
               <w:rPr>
                 <w:rStyle w:val="Hyperlink"/>
@@ -962,7 +962,7 @@
                 <w:noProof/>
                 <w:webHidden/>
               </w:rPr>
-              <w:instrText xml:space="preserve"> PAGEREF _Toc205856382 \h </w:instrText>
+              <w:instrText xml:space="preserve"> PAGEREF _Toc205890454 \h </w:instrText>
             </w:r>
             <w:r>
               <w:rPr>
@@ -1007,7 +1007,7 @@
               <w:sz w:val="24"/>
             </w:rPr>
           </w:pPr>
-          <w:hyperlink w:anchor="_Toc205856383" w:history="1">
+          <w:hyperlink w:anchor="_Toc205890455" w:history="1">
             <w:r>
               <w:rPr>
                 <w:rStyle w:val="Hyperlink"/>
@@ -1053,7 +1053,7 @@
                 <w:noProof/>
                 <w:webHidden/>
               </w:rPr>
-              <w:instrText xml:space="preserve"> PAGEREF _Toc205856383 \h </w:instrText>
+              <w:instrText xml:space="preserve"> PAGEREF _Toc205890455 \h </w:instrText>
             </w:r>
             <w:r>
               <w:rPr>
@@ -1098,7 +1098,7 @@
               <w:sz w:val="24"/>
             </w:rPr>
           </w:pPr>
-          <w:hyperlink w:anchor="_Toc205856384" w:history="1">
+          <w:hyperlink w:anchor="_Toc205890456" w:history="1">
             <w:r>
               <w:rPr>
                 <w:rStyle w:val="Hyperlink"/>
@@ -1144,7 +1144,7 @@
                 <w:noProof/>
                 <w:webHidden/>
               </w:rPr>
-              <w:instrText xml:space="preserve"> PAGEREF _Toc205856384 \h </w:instrText>
+              <w:instrText xml:space="preserve"> PAGEREF _Toc205890456 \h </w:instrText>
             </w:r>
             <w:r>
               <w:rPr>
@@ -1189,7 +1189,7 @@
               <w:sz w:val="24"/>
             </w:rPr>
           </w:pPr>
-          <w:hyperlink w:anchor="_Toc205856386" w:history="1">
+          <w:hyperlink w:anchor="_Toc205890458" w:history="1">
             <w:r>
               <w:rPr>
                 <w:rStyle w:val="Hyperlink"/>
@@ -1235,7 +1235,7 @@
                 <w:noProof/>
                 <w:webHidden/>
               </w:rPr>
-              <w:instrText xml:space="preserve"> PAGEREF _Toc205856386 \h </w:instrText>
+              <w:instrText xml:space="preserve"> PAGEREF _Toc205890458 \h </w:instrText>
             </w:r>
             <w:r>
               <w:rPr>
@@ -1280,7 +1280,7 @@
               <w:sz w:val="24"/>
             </w:rPr>
           </w:pPr>
-          <w:hyperlink w:anchor="_Toc205856387" w:history="1">
+          <w:hyperlink w:anchor="_Toc205890459" w:history="1">
             <w:r>
               <w:rPr>
                 <w:rStyle w:val="Hyperlink"/>
@@ -1326,7 +1326,7 @@
                 <w:noProof/>
                 <w:webHidden/>
               </w:rPr>
-              <w:instrText xml:space="preserve"> PAGEREF _Toc205856387 \h </w:instrText>
+              <w:instrText xml:space="preserve"> PAGEREF _Toc205890459 \h </w:instrText>
             </w:r>
             <w:r>
               <w:rPr>
@@ -1371,7 +1371,7 @@
               <w:sz w:val="24"/>
             </w:rPr>
           </w:pPr>
-          <w:hyperlink w:anchor="_Toc205856388" w:history="1">
+          <w:hyperlink w:anchor="_Toc205890460" w:history="1">
             <w:r>
               <w:rPr>
                 <w:rStyle w:val="Hyperlink"/>
@@ -1417,7 +1417,7 @@
                 <w:noProof/>
                 <w:webHidden/>
               </w:rPr>
-              <w:instrText xml:space="preserve"> PAGEREF _Toc205856388 \h </w:instrText>
+              <w:instrText xml:space="preserve"> PAGEREF _Toc205890460 \h </w:instrText>
             </w:r>
             <w:r>
               <w:rPr>
@@ -1462,7 +1462,7 @@
               <w:sz w:val="24"/>
             </w:rPr>
           </w:pPr>
-          <w:hyperlink w:anchor="_Toc205856389" w:history="1">
+          <w:hyperlink w:anchor="_Toc205890461" w:history="1">
             <w:r>
               <w:rPr>
                 <w:rStyle w:val="Hyperlink"/>
@@ -1508,7 +1508,7 @@
                 <w:noProof/>
                 <w:webHidden/>
               </w:rPr>
-              <w:instrText xml:space="preserve"> PAGEREF _Toc205856389 \h </w:instrText>
+              <w:instrText xml:space="preserve"> PAGEREF _Toc205890461 \h </w:instrText>
             </w:r>
             <w:r>
               <w:rPr>
@@ -1553,7 +1553,7 @@
               <w:sz w:val="24"/>
             </w:rPr>
           </w:pPr>
-          <w:hyperlink w:anchor="_Toc205856390" w:history="1">
+          <w:hyperlink w:anchor="_Toc205890462" w:history="1">
             <w:r>
               <w:rPr>
                 <w:rStyle w:val="Hyperlink"/>
@@ -1599,7 +1599,7 @@
                 <w:noProof/>
                 <w:webHidden/>
               </w:rPr>
-              <w:instrText xml:space="preserve"> PAGEREF _Toc205856390 \h </w:instrText>
+              <w:instrText xml:space="preserve"> PAGEREF _Toc205890462 \h </w:instrText>
             </w:r>
             <w:r>
               <w:rPr>
@@ -1644,7 +1644,7 @@
               <w:sz w:val="24"/>
             </w:rPr>
           </w:pPr>
-          <w:hyperlink w:anchor="_Toc205856391" w:history="1">
+          <w:hyperlink w:anchor="_Toc205890463" w:history="1">
             <w:r>
               <w:rPr>
                 <w:rStyle w:val="Hyperlink"/>
@@ -1692,7 +1692,7 @@
                 <w:noProof/>
                 <w:webHidden/>
               </w:rPr>
-              <w:instrText xml:space="preserve"> PAGEREF _Toc205856391 \h </w:instrText>
+              <w:instrText xml:space="preserve"> PAGEREF _Toc205890463 \h </w:instrText>
             </w:r>
             <w:r>
               <w:rPr>
@@ -1737,7 +1737,7 @@
               <w:sz w:val="24"/>
             </w:rPr>
           </w:pPr>
-          <w:hyperlink w:anchor="_Toc205856392" w:history="1">
+          <w:hyperlink w:anchor="_Toc205890464" w:history="1">
             <w:r>
               <w:rPr>
                 <w:rStyle w:val="Hyperlink"/>
@@ -1786,7 +1786,7 @@
                 <w:noProof/>
                 <w:webHidden/>
               </w:rPr>
-              <w:instrText xml:space="preserve"> PAGEREF _Toc205856392 \h </w:instrText>
+              <w:instrText xml:space="preserve"> PAGEREF _Toc205890464 \h </w:instrText>
             </w:r>
             <w:r>
               <w:rPr>
@@ -1831,7 +1831,7 @@
               <w:sz w:val="24"/>
             </w:rPr>
           </w:pPr>
-          <w:hyperlink w:anchor="_Toc205856393" w:history="1">
+          <w:hyperlink w:anchor="_Toc205890465" w:history="1">
             <w:r>
               <w:rPr>
                 <w:rStyle w:val="Hyperlink"/>
@@ -1880,100 +1880,7 @@
                 <w:noProof/>
                 <w:webHidden/>
               </w:rPr>
-              <w:instrText xml:space="preserve"> PAGEREF _Toc205856393 \h </w:instrText>
-            </w:r>
-            <w:r>
-              <w:rPr>
-                <w:noProof/>
-                <w:webHidden/>
-              </w:rPr>
-            </w:r>
-            <w:r>
-              <w:rPr>
-                <w:noProof/>
-                <w:webHidden/>
-              </w:rPr>
-              <w:fldChar w:fldCharType="separate"/>
-            </w:r>
-            <w:r>
-              <w:rPr>
-                <w:noProof/>
-                <w:webHidden/>
-              </w:rPr>
-              <w:t>5</w:t>
-            </w:r>
-            <w:r>
-              <w:rPr>
-                <w:noProof/>
-                <w:webHidden/>
-              </w:rPr>
-              <w:fldChar w:fldCharType="end"/>
-            </w:r>
-          </w:hyperlink>
-        </w:p>
-        <w:p>
-          <w:pPr>
-            <w:pStyle w:val="TOC3"/>
-            <w:tabs>
-              <w:tab w:val="left" w:pos="1680"/>
-              <w:tab w:val="right" w:pos="9894"/>
-            </w:tabs>
-            <w:rPr>
-              <w:rFonts w:asciiTheme="minorHAnsi" w:eastAsiaTheme="minorEastAsia" w:hAnsiTheme="minorHAnsi" w:cstheme="minorBidi"/>
-              <w:noProof/>
-              <w:color w:val="auto"/>
-              <w:sz w:val="24"/>
-            </w:rPr>
-          </w:pPr>
-          <w:hyperlink w:anchor="_Toc205856394" w:history="1">
-            <w:r>
-              <w:rPr>
-                <w:rStyle w:val="Hyperlink"/>
-                <w:rFonts w:eastAsiaTheme="majorEastAsia"/>
-                <w:i/>
-                <w:iCs/>
-                <w:noProof/>
-              </w:rPr>
-              <w:t>2.2.4</w:t>
-            </w:r>
-            <w:r>
-              <w:rPr>
-                <w:rFonts w:asciiTheme="minorHAnsi" w:eastAsiaTheme="minorEastAsia" w:hAnsiTheme="minorHAnsi" w:cstheme="minorBidi"/>
-                <w:noProof/>
-                <w:color w:val="auto"/>
-                <w:sz w:val="24"/>
-              </w:rPr>
-              <w:tab/>
-            </w:r>
-            <w:r>
-              <w:rPr>
-                <w:rStyle w:val="Hyperlink"/>
-                <w:rFonts w:eastAsiaTheme="majorEastAsia"/>
-                <w:i/>
-                <w:noProof/>
-              </w:rPr>
-              <w:t>Korisnik ne unosi korisničko ime ili lozinku</w:t>
-            </w:r>
-            <w:r>
-              <w:rPr>
-                <w:noProof/>
-                <w:webHidden/>
-              </w:rPr>
-              <w:tab/>
-            </w:r>
-            <w:r>
-              <w:rPr>
-                <w:noProof/>
-                <w:webHidden/>
-              </w:rPr>
-              <w:fldChar w:fldCharType="begin"/>
-            </w:r>
-            <w:r>
-              <w:rPr>
-                <w:noProof/>
-                <w:webHidden/>
-              </w:rPr>
-              <w:instrText xml:space="preserve"> PAGEREF _Toc205856394 \h </w:instrText>
+              <w:instrText xml:space="preserve"> PAGEREF _Toc205890465 \h </w:instrText>
             </w:r>
             <w:r>
               <w:rPr>
@@ -2018,7 +1925,7 @@
               <w:sz w:val="24"/>
             </w:rPr>
           </w:pPr>
-          <w:hyperlink w:anchor="_Toc205856395" w:history="1">
+          <w:hyperlink w:anchor="_Toc205890466" w:history="1">
             <w:r>
               <w:rPr>
                 <w:rStyle w:val="Hyperlink"/>
@@ -2064,7 +1971,7 @@
                 <w:noProof/>
                 <w:webHidden/>
               </w:rPr>
-              <w:instrText xml:space="preserve"> PAGEREF _Toc205856395 \h </w:instrText>
+              <w:instrText xml:space="preserve"> PAGEREF _Toc205890466 \h </w:instrText>
             </w:r>
             <w:r>
               <w:rPr>
@@ -2109,7 +2016,7 @@
               <w:sz w:val="24"/>
             </w:rPr>
           </w:pPr>
-          <w:hyperlink w:anchor="_Toc205856396" w:history="1">
+          <w:hyperlink w:anchor="_Toc205890467" w:history="1">
             <w:r>
               <w:rPr>
                 <w:rStyle w:val="Hyperlink"/>
@@ -2155,7 +2062,7 @@
                 <w:noProof/>
                 <w:webHidden/>
               </w:rPr>
-              <w:instrText xml:space="preserve"> PAGEREF _Toc205856396 \h </w:instrText>
+              <w:instrText xml:space="preserve"> PAGEREF _Toc205890467 \h </w:instrText>
             </w:r>
             <w:r>
               <w:rPr>
@@ -2200,7 +2107,7 @@
               <w:sz w:val="24"/>
             </w:rPr>
           </w:pPr>
-          <w:hyperlink w:anchor="_Toc205856397" w:history="1">
+          <w:hyperlink w:anchor="_Toc205890468" w:history="1">
             <w:r>
               <w:rPr>
                 <w:rStyle w:val="Hyperlink"/>
@@ -2246,7 +2153,7 @@
                 <w:noProof/>
                 <w:webHidden/>
               </w:rPr>
-              <w:instrText xml:space="preserve"> PAGEREF _Toc205856397 \h </w:instrText>
+              <w:instrText xml:space="preserve"> PAGEREF _Toc205890468 \h </w:instrText>
             </w:r>
             <w:r>
               <w:rPr>
@@ -2313,7 +2220,7 @@
         <w:spacing w:after="63"/>
         <w:ind w:left="705" w:hanging="720"/>
       </w:pPr>
-      <w:bookmarkStart w:id="0" w:name="_Toc205856382"/>
+      <w:bookmarkStart w:id="0" w:name="_Toc205890454"/>
       <w:r>
         <w:t>Uvod</w:t>
       </w:r>
@@ -2327,7 +2234,7 @@
         <w:pStyle w:val="Heading2"/>
         <w:ind w:left="705" w:hanging="720"/>
       </w:pPr>
-      <w:bookmarkStart w:id="1" w:name="_Toc205856383"/>
+      <w:bookmarkStart w:id="1" w:name="_Toc205890455"/>
       <w:r>
         <w:t>Rezime</w:t>
       </w:r>
@@ -2369,7 +2276,7 @@
         <w:spacing w:after="83"/>
         <w:ind w:left="705" w:hanging="720"/>
       </w:pPr>
-      <w:bookmarkStart w:id="2" w:name="_Toc205856384"/>
+      <w:bookmarkStart w:id="2" w:name="_Toc205890456"/>
       <w:r>
         <w:t>Namena dokumenta i ciljne grupe</w:t>
       </w:r>
@@ -2389,6 +2296,7 @@
       </w:pPr>
       <w:bookmarkStart w:id="3" w:name="_Toc205809932"/>
       <w:bookmarkStart w:id="4" w:name="_Toc205856385"/>
+      <w:bookmarkStart w:id="5" w:name="_Toc205890457"/>
       <w:r>
         <w:rPr>
           <w:rFonts w:ascii="Times New Roman" w:eastAsia="Times New Roman" w:hAnsi="Times New Roman" w:cs="Times New Roman"/>
@@ -2412,17 +2320,18 @@
       </w:r>
       <w:bookmarkEnd w:id="3"/>
       <w:bookmarkEnd w:id="4"/>
+      <w:bookmarkEnd w:id="5"/>
     </w:p>
     <w:p>
       <w:pPr>
         <w:pStyle w:val="Heading2"/>
         <w:ind w:left="705" w:hanging="720"/>
       </w:pPr>
-      <w:bookmarkStart w:id="5" w:name="_Toc205856386"/>
+      <w:bookmarkStart w:id="6" w:name="_Toc205890458"/>
       <w:r>
         <w:t>Reference</w:t>
       </w:r>
-      <w:bookmarkEnd w:id="5"/>
+      <w:bookmarkEnd w:id="6"/>
       <w:r>
         <w:t xml:space="preserve"> </w:t>
       </w:r>
@@ -2501,11 +2410,11 @@
         <w:spacing w:after="0"/>
         <w:ind w:left="705" w:hanging="720"/>
       </w:pPr>
-      <w:bookmarkStart w:id="6" w:name="_Toc205856387"/>
+      <w:bookmarkStart w:id="7" w:name="_Toc205890459"/>
       <w:r>
         <w:t>Otvorena pitanja</w:t>
       </w:r>
-      <w:bookmarkEnd w:id="6"/>
+      <w:bookmarkEnd w:id="7"/>
       <w:r>
         <w:t xml:space="preserve"> </w:t>
       </w:r>
@@ -2987,14 +2896,14 @@
         <w:pStyle w:val="Heading1"/>
         <w:ind w:left="705" w:hanging="720"/>
       </w:pPr>
-      <w:bookmarkStart w:id="7" w:name="_Toc205856388"/>
+      <w:bookmarkStart w:id="8" w:name="_Toc205890460"/>
       <w:r>
         <w:t xml:space="preserve">Scenario </w:t>
       </w:r>
       <w:r>
         <w:t>prijave na sistem</w:t>
       </w:r>
-      <w:bookmarkEnd w:id="7"/>
+      <w:bookmarkEnd w:id="8"/>
       <w:r>
         <w:t xml:space="preserve"> </w:t>
       </w:r>
@@ -3017,14 +2926,14 @@
         <w:spacing w:after="57"/>
         <w:ind w:left="705" w:hanging="720"/>
       </w:pPr>
-      <w:bookmarkStart w:id="8" w:name="_Toc205856389"/>
+      <w:bookmarkStart w:id="9" w:name="_Toc205890461"/>
       <w:r>
         <w:rPr>
           <w:u w:val="single" w:color="000000"/>
         </w:rPr>
         <w:t>Kratak opis</w:t>
       </w:r>
-      <w:bookmarkEnd w:id="8"/>
+      <w:bookmarkEnd w:id="9"/>
       <w:r>
         <w:t xml:space="preserve"> </w:t>
       </w:r>
@@ -3062,14 +2971,14 @@
         <w:spacing w:after="57"/>
         <w:ind w:left="705" w:hanging="720"/>
       </w:pPr>
-      <w:bookmarkStart w:id="9" w:name="_Toc205856390"/>
+      <w:bookmarkStart w:id="10" w:name="_Toc205890462"/>
       <w:r>
         <w:rPr>
           <w:u w:val="single" w:color="000000"/>
         </w:rPr>
         <w:t>Tok dogadjaja</w:t>
       </w:r>
-      <w:bookmarkEnd w:id="9"/>
+      <w:bookmarkEnd w:id="10"/>
       <w:r>
         <w:t xml:space="preserve"> </w:t>
       </w:r>
@@ -3080,7 +2989,7 @@
         <w:spacing w:after="56"/>
         <w:ind w:left="720" w:hanging="720"/>
       </w:pPr>
-      <w:bookmarkStart w:id="10" w:name="_Toc205856391"/>
+      <w:bookmarkStart w:id="11" w:name="_Toc205890463"/>
       <w:r>
         <w:rPr>
           <w:i/>
@@ -3093,7 +3002,7 @@
         </w:rPr>
         <w:t xml:space="preserve"> fundira umetnika</w:t>
       </w:r>
-      <w:bookmarkEnd w:id="10"/>
+      <w:bookmarkEnd w:id="11"/>
       <w:r>
         <w:rPr>
           <w:i/>
@@ -3314,7 +3223,7 @@
           <w:u w:val="none"/>
         </w:rPr>
       </w:pPr>
-      <w:bookmarkStart w:id="11" w:name="_Toc205856392"/>
+      <w:bookmarkStart w:id="12" w:name="_Toc205890464"/>
       <w:r>
         <w:rPr>
           <w:i/>
@@ -3332,7 +3241,7 @@
         </w:rPr>
         <w:t>neispravne podatke za plaćanje</w:t>
       </w:r>
-      <w:bookmarkEnd w:id="11"/>
+      <w:bookmarkEnd w:id="12"/>
       <w:r>
         <w:rPr>
           <w:i/>
@@ -3487,7 +3396,7 @@
           <w:u w:val="none"/>
         </w:rPr>
       </w:pPr>
-      <w:bookmarkStart w:id="12" w:name="_Toc205856393"/>
+      <w:bookmarkStart w:id="13" w:name="_Toc205890465"/>
       <w:r>
         <w:rPr>
           <w:i/>
@@ -3496,7 +3405,7 @@
         </w:rPr>
         <w:t>Transakcija neuspešna (odbijena)</w:t>
       </w:r>
-      <w:bookmarkEnd w:id="12"/>
+      <w:bookmarkEnd w:id="13"/>
     </w:p>
     <w:p>
       <w:pPr>
@@ -3517,7 +3426,21 @@
           <w:rFonts w:ascii="Times New Roman" w:eastAsia="Times New Roman" w:hAnsi="Times New Roman" w:cs="Times New Roman"/>
           <w:sz w:val="20"/>
         </w:rPr>
-        <w:t>Akcija 1 iz scenarija 2.2.1.</w:t>
+        <w:t>Akcije 1 do 5 su iste kao u scenariju</w:t>
+      </w:r>
+      <w:r>
+        <w:rPr>
+          <w:rFonts w:ascii="Times New Roman" w:eastAsia="Times New Roman" w:hAnsi="Times New Roman" w:cs="Times New Roman"/>
+          <w:sz w:val="20"/>
+        </w:rPr>
+        <w:t xml:space="preserve"> 2.2.1</w:t>
+      </w:r>
+      <w:r>
+        <w:rPr>
+          <w:rFonts w:ascii="Times New Roman" w:eastAsia="Times New Roman" w:hAnsi="Times New Roman" w:cs="Times New Roman"/>
+          <w:sz w:val="20"/>
+        </w:rPr>
+        <w:t>.</w:t>
       </w:r>
     </w:p>
     <w:p>
@@ -3539,7 +3462,7 @@
           <w:rFonts w:ascii="Times New Roman" w:eastAsia="Times New Roman" w:hAnsi="Times New Roman" w:cs="Times New Roman"/>
           <w:sz w:val="20"/>
         </w:rPr>
-        <w:t>Korisnik unosi korisničko ime koje ne postoji u bazi.</w:t>
+        <w:t>Korisnik unosi ispravne kredencijale.</w:t>
       </w:r>
     </w:p>
     <w:p>
@@ -3561,57 +3484,7 @@
           <w:rFonts w:ascii="Times New Roman" w:eastAsia="Times New Roman" w:hAnsi="Times New Roman" w:cs="Times New Roman"/>
           <w:sz w:val="20"/>
         </w:rPr>
-        <w:t>Sistem vraća formu za prijavu sa porukom:</w:t>
-      </w:r>
-      <w:r>
-        <w:rPr>
-          <w:rFonts w:ascii="Times New Roman" w:eastAsia="Times New Roman" w:hAnsi="Times New Roman" w:cs="Times New Roman"/>
-          <w:sz w:val="20"/>
-        </w:rPr>
-        <w:t xml:space="preserve"> </w:t>
-      </w:r>
-      <w:r>
-        <w:rPr>
-          <w:rFonts w:ascii="Times New Roman" w:eastAsia="Times New Roman" w:hAnsi="Times New Roman" w:cs="Times New Roman"/>
-          <w:sz w:val="20"/>
-        </w:rPr>
-        <w:t>"Korisničko ime ne postoji."</w:t>
-      </w:r>
-    </w:p>
-    <w:p>
-      <w:pPr>
-        <w:spacing w:after="113"/>
-        <w:ind w:left="540"/>
-      </w:pPr>
-      <w:r>
-        <w:rPr>
-          <w:rFonts w:ascii="Times New Roman" w:eastAsia="Times New Roman" w:hAnsi="Times New Roman" w:cs="Times New Roman"/>
-          <w:sz w:val="20"/>
-        </w:rPr>
-        <w:t xml:space="preserve"> </w:t>
-      </w:r>
-    </w:p>
-    <w:p>
-      <w:pPr>
-        <w:pStyle w:val="Heading3"/>
-        <w:spacing w:after="60"/>
-        <w:ind w:left="720" w:hanging="720"/>
-      </w:pPr>
-      <w:bookmarkStart w:id="13" w:name="_Toc205856394"/>
-      <w:r>
-        <w:rPr>
-          <w:i/>
-          <w:u w:val="none"/>
-        </w:rPr>
-        <w:t>Korisnik ne unosi korisničko ime ili lozinku</w:t>
-      </w:r>
-      <w:bookmarkEnd w:id="13"/>
-      <w:r>
-        <w:rPr>
-          <w:i/>
-          <w:u w:val="none"/>
-        </w:rPr>
-        <w:t xml:space="preserve"> </w:t>
+        <w:t>Korisnik pritiska dugme "Potvrdi".</w:t>
       </w:r>
     </w:p>
     <w:p>
@@ -3633,21 +3506,7 @@
           <w:rFonts w:ascii="Times New Roman" w:eastAsia="Times New Roman" w:hAnsi="Times New Roman" w:cs="Times New Roman"/>
           <w:sz w:val="20"/>
         </w:rPr>
-        <w:t>Akcije 1 do 5 su iste kao u scenariju</w:t>
-      </w:r>
-      <w:r>
-        <w:rPr>
-          <w:rFonts w:ascii="Times New Roman" w:eastAsia="Times New Roman" w:hAnsi="Times New Roman" w:cs="Times New Roman"/>
-          <w:sz w:val="20"/>
-        </w:rPr>
-        <w:t xml:space="preserve"> 2.2.1</w:t>
-      </w:r>
-      <w:r>
-        <w:rPr>
-          <w:rFonts w:ascii="Times New Roman" w:eastAsia="Times New Roman" w:hAnsi="Times New Roman" w:cs="Times New Roman"/>
-          <w:sz w:val="20"/>
-        </w:rPr>
-        <w:t>.</w:t>
+        <w:t>Transakcija je odbijena od strane banke (npr. zbog nedovoljnih sredstava).</w:t>
       </w:r>
     </w:p>
     <w:p>
@@ -3669,7 +3528,7 @@
           <w:rFonts w:ascii="Times New Roman" w:eastAsia="Times New Roman" w:hAnsi="Times New Roman" w:cs="Times New Roman"/>
           <w:sz w:val="20"/>
         </w:rPr>
-        <w:t>Korisnik unosi ispravne kredencijale.</w:t>
+        <w:t>Sistem prikazuje poruku o neuspehu transakcije, npr. "Transakcija nije uspela. Proverite stanje na računu ili pokušajte sa drugom karticom.".</w:t>
       </w:r>
     </w:p>
     <w:p>
@@ -3691,7 +3550,64 @@
           <w:rFonts w:ascii="Times New Roman" w:eastAsia="Times New Roman" w:hAnsi="Times New Roman" w:cs="Times New Roman"/>
           <w:sz w:val="20"/>
         </w:rPr>
-        <w:t>Korisnik pritiska dugme "Potvrdi".</w:t>
+        <w:t>Korisnik ostaje na stranici za plaćanje i ima mogućnost ponovnog unosa podataka.</w:t>
+      </w:r>
+    </w:p>
+    <w:p>
+      <w:pPr>
+        <w:spacing w:after="113"/>
+      </w:pPr>
+    </w:p>
+    <w:p>
+      <w:pPr>
+        <w:pStyle w:val="Heading2"/>
+        <w:spacing w:after="220"/>
+        <w:ind w:left="705" w:hanging="720"/>
+      </w:pPr>
+      <w:bookmarkStart w:id="14" w:name="_Toc205890466"/>
+      <w:r>
+        <w:t>Posebni zahtevi</w:t>
+      </w:r>
+      <w:bookmarkEnd w:id="14"/>
+      <w:r>
+        <w:t xml:space="preserve"> </w:t>
+      </w:r>
+    </w:p>
+    <w:p>
+      <w:pPr>
+        <w:pStyle w:val="ListParagraph"/>
+        <w:numPr>
+          <w:ilvl w:val="0"/>
+          <w:numId w:val="14"/>
+        </w:numPr>
+        <w:rPr>
+          <w:rFonts w:ascii="Times New Roman" w:hAnsi="Times New Roman" w:cs="Times New Roman"/>
+          <w:sz w:val="20"/>
+          <w:szCs w:val="22"/>
+        </w:rPr>
+      </w:pPr>
+      <w:r>
+        <w:rPr>
+          <w:rFonts w:ascii="Times New Roman" w:hAnsi="Times New Roman" w:cs="Times New Roman"/>
+          <w:sz w:val="20"/>
+          <w:szCs w:val="22"/>
+        </w:rPr>
+        <w:t>Aplikacija treba reagovati u razumnom vremenu.</w:t>
+      </w:r>
+    </w:p>
+    <w:p>
+      <w:pPr>
+        <w:pStyle w:val="Heading2"/>
+        <w:spacing w:after="195"/>
+        <w:ind w:left="705" w:hanging="720"/>
+      </w:pPr>
+      <w:bookmarkStart w:id="15" w:name="_Toc205890467"/>
+      <w:r>
+        <w:t>Preduslovi</w:t>
+      </w:r>
+      <w:bookmarkEnd w:id="15"/>
+      <w:r>
+        <w:t xml:space="preserve">  </w:t>
       </w:r>
     </w:p>
     <w:p>
@@ -3713,7 +3629,7 @@
           <w:rFonts w:ascii="Times New Roman" w:eastAsia="Times New Roman" w:hAnsi="Times New Roman" w:cs="Times New Roman"/>
           <w:sz w:val="20"/>
         </w:rPr>
-        <w:t>Transakcija je odbijena od strane banke (npr. zbog nedovoljnih sredstava).</w:t>
+        <w:t>Korisnik mora biti prijavljen na sistem.</w:t>
       </w:r>
     </w:p>
     <w:p>
@@ -3735,7 +3651,7 @@
           <w:rFonts w:ascii="Times New Roman" w:eastAsia="Times New Roman" w:hAnsi="Times New Roman" w:cs="Times New Roman"/>
           <w:sz w:val="20"/>
         </w:rPr>
-        <w:t>Sistem prikazuje poruku o neuspehu transakcije, npr. "Transakcija nije uspela. Proverite stanje na računu ili pokušajte sa drugom karticom.".</w:t>
+        <w:t>Korisnik mora imati platnu karticu sa dovoljno sredstava, I znati sve njene podatke za plaćanje.</w:t>
       </w:r>
     </w:p>
     <w:p>
@@ -3757,64 +3673,7 @@
           <w:rFonts w:ascii="Times New Roman" w:eastAsia="Times New Roman" w:hAnsi="Times New Roman" w:cs="Times New Roman"/>
           <w:sz w:val="20"/>
         </w:rPr>
-        <w:t>Korisnik ostaje na stranici za plaćanje i ima mogućnost ponovnog unosa podataka.</w:t>
-      </w:r>
-    </w:p>
-    <w:p>
-      <w:pPr>
-        <w:spacing w:after="113"/>
-      </w:pPr>
-    </w:p>
-    <w:p>
-      <w:pPr>
-        <w:pStyle w:val="Heading2"/>
-        <w:spacing w:after="220"/>
-        <w:ind w:left="705" w:hanging="720"/>
-      </w:pPr>
-      <w:bookmarkStart w:id="14" w:name="_Toc205856395"/>
-      <w:r>
-        <w:t>Posebni zahtevi</w:t>
-      </w:r>
-      <w:bookmarkEnd w:id="14"/>
-      <w:r>
-        <w:t xml:space="preserve"> </w:t>
-      </w:r>
-    </w:p>
-    <w:p>
-      <w:pPr>
-        <w:pStyle w:val="ListParagraph"/>
-        <w:numPr>
-          <w:ilvl w:val="0"/>
-          <w:numId w:val="14"/>
-        </w:numPr>
-        <w:rPr>
-          <w:rFonts w:ascii="Times New Roman" w:hAnsi="Times New Roman" w:cs="Times New Roman"/>
-          <w:sz w:val="20"/>
-          <w:szCs w:val="22"/>
-        </w:rPr>
-      </w:pPr>
-      <w:r>
-        <w:rPr>
-          <w:rFonts w:ascii="Times New Roman" w:hAnsi="Times New Roman" w:cs="Times New Roman"/>
-          <w:sz w:val="20"/>
-          <w:szCs w:val="22"/>
-        </w:rPr>
-        <w:t>Aplikacija treba reagovati u razumnom vremenu.</w:t>
-      </w:r>
-    </w:p>
-    <w:p>
-      <w:pPr>
-        <w:pStyle w:val="Heading2"/>
-        <w:spacing w:after="195"/>
-        <w:ind w:left="705" w:hanging="720"/>
-      </w:pPr>
-      <w:bookmarkStart w:id="15" w:name="_Toc205856396"/>
-      <w:r>
-        <w:t>Preduslovi</w:t>
-      </w:r>
-      <w:bookmarkEnd w:id="15"/>
-      <w:r>
-        <w:t xml:space="preserve">  </w:t>
+        <w:t>Umetnik mora imati kreiran profil u sistemu.</w:t>
       </w:r>
     </w:p>
     <w:p>
@@ -3836,7 +3695,7 @@
           <w:rFonts w:ascii="Times New Roman" w:eastAsia="Times New Roman" w:hAnsi="Times New Roman" w:cs="Times New Roman"/>
           <w:sz w:val="20"/>
         </w:rPr>
-        <w:t>Korisnik mora biti prijavljen na sistem.</w:t>
+        <w:t>Sistem za plaćanje mora biti funkcionalan.</w:t>
       </w:r>
     </w:p>
     <w:p>
@@ -3853,72 +3712,6 @@
           <w:sz w:val="20"/>
         </w:rPr>
       </w:pPr>
-      <w:r>
-        <w:rPr>
-          <w:rFonts w:ascii="Times New Roman" w:eastAsia="Times New Roman" w:hAnsi="Times New Roman" w:cs="Times New Roman"/>
-          <w:sz w:val="20"/>
-        </w:rPr>
-        <w:t>Korisnik mora imati platnu karticu sa dovoljno sredstava, I znati sve njene podatke za plaćanje.</w:t>
-      </w:r>
-    </w:p>
-    <w:p>
-      <w:pPr>
-        <w:pStyle w:val="ListParagraph"/>
-        <w:numPr>
-          <w:ilvl w:val="0"/>
-          <w:numId w:val="8"/>
-        </w:numPr>
-        <w:spacing w:after="3" w:line="252" w:lineRule="auto"/>
-        <w:ind w:right="1291"/>
-        <w:rPr>
-          <w:rFonts w:ascii="Times New Roman" w:eastAsia="Times New Roman" w:hAnsi="Times New Roman" w:cs="Times New Roman"/>
-          <w:sz w:val="20"/>
-        </w:rPr>
-      </w:pPr>
-      <w:r>
-        <w:rPr>
-          <w:rFonts w:ascii="Times New Roman" w:eastAsia="Times New Roman" w:hAnsi="Times New Roman" w:cs="Times New Roman"/>
-          <w:sz w:val="20"/>
-        </w:rPr>
-        <w:t>Umetnik mora imati kreiran profil u sistemu.</w:t>
-      </w:r>
-    </w:p>
-    <w:p>
-      <w:pPr>
-        <w:pStyle w:val="ListParagraph"/>
-        <w:numPr>
-          <w:ilvl w:val="0"/>
-          <w:numId w:val="8"/>
-        </w:numPr>
-        <w:spacing w:after="3" w:line="252" w:lineRule="auto"/>
-        <w:ind w:right="1291"/>
-        <w:rPr>
-          <w:rFonts w:ascii="Times New Roman" w:eastAsia="Times New Roman" w:hAnsi="Times New Roman" w:cs="Times New Roman"/>
-          <w:sz w:val="20"/>
-        </w:rPr>
-      </w:pPr>
-      <w:r>
-        <w:rPr>
-          <w:rFonts w:ascii="Times New Roman" w:eastAsia="Times New Roman" w:hAnsi="Times New Roman" w:cs="Times New Roman"/>
-          <w:sz w:val="20"/>
-        </w:rPr>
-        <w:t>Sistem za plaćanje mora biti funkcionalan.</w:t>
-      </w:r>
-    </w:p>
-    <w:p>
-      <w:pPr>
-        <w:pStyle w:val="ListParagraph"/>
-        <w:numPr>
-          <w:ilvl w:val="0"/>
-          <w:numId w:val="8"/>
-        </w:numPr>
-        <w:spacing w:after="3" w:line="252" w:lineRule="auto"/>
-        <w:ind w:right="1291"/>
-        <w:rPr>
-          <w:rFonts w:ascii="Times New Roman" w:eastAsia="Times New Roman" w:hAnsi="Times New Roman" w:cs="Times New Roman"/>
-          <w:sz w:val="20"/>
-        </w:rPr>
-      </w:pPr>
     </w:p>
     <w:p>
       <w:pPr>
@@ -3926,7 +3719,7 @@
         <w:spacing w:after="90"/>
         <w:ind w:left="705" w:hanging="720"/>
       </w:pPr>
-      <w:bookmarkStart w:id="16" w:name="_Toc205856397"/>
+      <w:bookmarkStart w:id="16" w:name="_Toc205890468"/>
       <w:r>
         <w:t>Posledice</w:t>
       </w:r>
@@ -7291,6 +7084,7 @@
   <w:style w:type="character" w:default="1" w:styleId="DefaultParagraphFont">
     <w:name w:val="Default Paragraph Font"/>
     <w:uiPriority w:val="1"/>
+    <w:semiHidden/>
     <w:unhideWhenUsed/>
   </w:style>
   <w:style w:type="table" w:default="1" w:styleId="TableNormal">

</xml_diff>